<commit_message>
Address import review: shared rules, UTF-8 errors and richer Word sample
</commit_message>
<xml_diff>
--- a/samples/project-brief.docx
+++ b/samples/project-brief.docx
@@ -28,18 +28,66 @@
         </w:rPr>
         <w:t>usable editor</w:t>
       </w:r>
+      <w:r>
+        <w:t xml:space="preserve"> with </w:t>
+      </w:r>
+      <w:r>
+        <w:rPr>
+          <w:i/>
+        </w:rPr>
+        <w:t>clear priorities</w:t>
+      </w:r>
+      <w:r>
+        <w:t xml:space="preserve"> and </w:t>
+      </w:r>
+      <w:r>
+        <w:rPr>
+          <w:u w:val="single"/>
+        </w:rPr>
+        <w:t>reliable saving</w:t>
+      </w:r>
+      <w:r>
+        <w:t>.</w:t>
+      </w:r>
     </w:p>
     <w:p>
       <w:pPr>
         <w:pStyle w:val="Heading2"/>
       </w:pPr>
       <w:r>
-        <w:t>Delivery</w:t>
+        <w:t>Delivery checklist</w:t>
       </w:r>
     </w:p>
     <w:p>
+      <w:pPr>
+        <w:pStyle w:val="ListBullet"/>
+      </w:pPr>
       <w:r>
-        <w:t>Import files and preserve supported formatting.</w:t>
+        <w:t>Import files with supported formatting.</w:t>
+      </w:r>
+    </w:p>
+    <w:p>
+      <w:pPr>
+        <w:pStyle w:val="ListBullet"/>
+      </w:pPr>
+      <w:r>
+        <w:t>Check ownership and sharing access.</w:t>
+      </w:r>
+    </w:p>
+    <w:p>
+      <w:pPr>
+        <w:pStyle w:val="ListNumber"/>
+      </w:pPr>
+      <w:r>
+        <w:t>Review the deployed product.</w:t>
+      </w:r>
+    </w:p>
+    <w:p>
+      <w:pPr>
+        <w:pStyle w:val="ListNumber"/>
+      </w:pPr>
+      <w:r>
+        <w:t>Record the walkthrough video.</w:t>
       </w:r>
     </w:p>
     <w:sectPr>

</xml_diff>